<commit_message>
feat: sync repository, add Practical 11 & reports, remove legacy image folders
</commit_message>
<xml_diff>
--- a/Practical Files/24DIT027_ITUE301_Practical4.docx
+++ b/Practical Files/24DIT027_ITUE301_Practical4.docx
@@ -432,8 +432,8 @@
       </w:pPr>
       <w:r>
         <w:drawing>
-          <wp:inline wp14:editId="6CF84C05" wp14:anchorId="38035C6C">
-            <wp:extent cx="1409700" cy="4297680"/>
+          <wp:inline wp14:editId="02BDA96A" wp14:anchorId="38035C6C">
+            <wp:extent cx="1295400" cy="3478168"/>
             <wp:effectExtent l="0" t="0" r="0" b="0"/>
             <wp:docPr id="800627235" name="drawing"/>
             <wp:cNvGraphicFramePr>
@@ -461,7 +461,7 @@
                   <pic:spPr>
                     <a:xfrm rot="0">
                       <a:off x="0" y="0"/>
-                      <a:ext cx="1409700" cy="4297680"/>
+                      <a:ext cx="1295400" cy="3478168"/>
                     </a:xfrm>
                     <a:prstGeom prst="rect">
                       <a:avLst/>
@@ -478,11 +478,6 @@
       <w:pPr>
         <w:spacing w:before="0" w:beforeAutospacing="off" w:after="0" w:afterAutospacing="off"/>
       </w:pPr>
-    </w:p>
-    <w:p>
-      <w:pPr>
-        <w:spacing w:before="0" w:beforeAutospacing="off" w:after="0" w:afterAutospacing="off"/>
-      </w:pPr>
       <w:r>
         <w:rPr>
           <w:b w:val="1"/>
@@ -542,27 +537,447 @@
     </w:p>
     <w:p>
       <w:pPr>
+        <w:pStyle w:val="Normal"/>
         <w:spacing w:before="0" w:beforeAutospacing="off" w:after="0" w:afterAutospacing="off"/>
       </w:pPr>
+      <w:r>
+        <w:drawing>
+          <wp:inline wp14:editId="60C27AC6" wp14:anchorId="41B92335">
+            <wp:extent cx="5943600" cy="4522622"/>
+            <wp:effectExtent l="0" t="0" r="0" b="0"/>
+            <wp:docPr id="1441008282" name="drawing"/>
+            <wp:cNvGraphicFramePr>
+              <a:graphicFrameLocks/>
+            </wp:cNvGraphicFramePr>
+            <a:graphic>
+              <a:graphicData xmlns:a="http://schemas.openxmlformats.org/drawingml/2006/main" uri="http://schemas.openxmlformats.org/drawingml/2006/picture">
+                <pic:pic xmlns:pic="http://schemas.openxmlformats.org/drawingml/2006/picture">
+                  <pic:nvPicPr>
+                    <pic:cNvPr id="1441008282" name="Picture 1441008282"/>
+                    <pic:cNvPicPr/>
+                  </pic:nvPicPr>
+                  <pic:blipFill>
+                    <a:blip xmlns:r="http://schemas.openxmlformats.org/officeDocument/2006/relationships" r:embed="rId2139238837">
+                      <a:extLst>
+                        <a:ext uri="{28A0092B-C50C-407E-A947-70E740481C1C}">
+                          <a14:useLocalDpi xmlns:a14="http://schemas.microsoft.com/office/drawing/2010/main"/>
+                        </a:ext>
+                      </a:extLst>
+                    </a:blip>
+                    <a:stretch>
+                      <a:fillRect/>
+                    </a:stretch>
+                  </pic:blipFill>
+                  <pic:spPr>
+                    <a:xfrm rot="0">
+                      <a:off x="0" y="0"/>
+                      <a:ext cx="5943600" cy="4522622"/>
+                    </a:xfrm>
+                    <a:prstGeom prst="rect">
+                      <a:avLst/>
+                    </a:prstGeom>
+                  </pic:spPr>
+                </pic:pic>
+              </a:graphicData>
+            </a:graphic>
+          </wp:inline>
+        </w:drawing>
+      </w:r>
+      <w:r>
+        <w:drawing>
+          <wp:inline wp14:editId="419A94FF" wp14:anchorId="382ABD63">
+            <wp:extent cx="5943600" cy="3246120"/>
+            <wp:effectExtent l="0" t="0" r="0" b="0"/>
+            <wp:docPr id="160751232" name="drawing"/>
+            <wp:cNvGraphicFramePr>
+              <a:graphicFrameLocks/>
+            </wp:cNvGraphicFramePr>
+            <a:graphic>
+              <a:graphicData xmlns:a="http://schemas.openxmlformats.org/drawingml/2006/main" uri="http://schemas.openxmlformats.org/drawingml/2006/picture">
+                <pic:pic xmlns:pic="http://schemas.openxmlformats.org/drawingml/2006/picture">
+                  <pic:nvPicPr>
+                    <pic:cNvPr id="160751232" name="Picture 160751232"/>
+                    <pic:cNvPicPr/>
+                  </pic:nvPicPr>
+                  <pic:blipFill>
+                    <a:blip xmlns:r="http://schemas.openxmlformats.org/officeDocument/2006/relationships" r:embed="rId1142920434">
+                      <a:extLst>
+                        <a:ext uri="{28A0092B-C50C-407E-A947-70E740481C1C}">
+                          <a14:useLocalDpi xmlns:a14="http://schemas.microsoft.com/office/drawing/2010/main"/>
+                        </a:ext>
+                      </a:extLst>
+                    </a:blip>
+                    <a:stretch>
+                      <a:fillRect/>
+                    </a:stretch>
+                  </pic:blipFill>
+                  <pic:spPr>
+                    <a:xfrm rot="0">
+                      <a:off x="0" y="0"/>
+                      <a:ext cx="5943600" cy="3246120"/>
+                    </a:xfrm>
+                    <a:prstGeom prst="rect">
+                      <a:avLst/>
+                    </a:prstGeom>
+                  </pic:spPr>
+                </pic:pic>
+              </a:graphicData>
+            </a:graphic>
+          </wp:inline>
+        </w:drawing>
+      </w:r>
+      <w:r>
+        <w:drawing>
+          <wp:inline wp14:editId="350EF9CF" wp14:anchorId="29EB0674">
+            <wp:extent cx="5943600" cy="2790825"/>
+            <wp:effectExtent l="0" t="0" r="0" b="0"/>
+            <wp:docPr id="731115746" name="drawing"/>
+            <wp:cNvGraphicFramePr>
+              <a:graphicFrameLocks noChangeAspect="1"/>
+            </wp:cNvGraphicFramePr>
+            <a:graphic>
+              <a:graphicData xmlns:a="http://schemas.openxmlformats.org/drawingml/2006/main" uri="http://schemas.openxmlformats.org/drawingml/2006/picture">
+                <pic:pic xmlns:pic="http://schemas.openxmlformats.org/drawingml/2006/picture">
+                  <pic:nvPicPr>
+                    <pic:cNvPr id="731115746" name="Picture 731115746"/>
+                    <pic:cNvPicPr/>
+                  </pic:nvPicPr>
+                  <pic:blipFill>
+                    <a:blip xmlns:r="http://schemas.openxmlformats.org/officeDocument/2006/relationships" r:embed="rId2047148432">
+                      <a:extLst>
+                        <a:ext uri="{28A0092B-C50C-407E-A947-70E740481C1C}">
+                          <a14:useLocalDpi xmlns:a14="http://schemas.microsoft.com/office/drawing/2010/main"/>
+                        </a:ext>
+                      </a:extLst>
+                    </a:blip>
+                    <a:stretch>
+                      <a:fillRect/>
+                    </a:stretch>
+                  </pic:blipFill>
+                  <pic:spPr>
+                    <a:xfrm rot="0">
+                      <a:off x="0" y="0"/>
+                      <a:ext cx="5943600" cy="2790825"/>
+                    </a:xfrm>
+                    <a:prstGeom prst="rect">
+                      <a:avLst/>
+                    </a:prstGeom>
+                  </pic:spPr>
+                </pic:pic>
+              </a:graphicData>
+            </a:graphic>
+          </wp:inline>
+        </w:drawing>
+      </w:r>
+      <w:r>
+        <w:drawing>
+          <wp:inline wp14:editId="592187F6" wp14:anchorId="104A7613">
+            <wp:extent cx="5943600" cy="2828925"/>
+            <wp:effectExtent l="0" t="0" r="0" b="0"/>
+            <wp:docPr id="1479525751" name="drawing"/>
+            <wp:cNvGraphicFramePr>
+              <a:graphicFrameLocks noChangeAspect="1"/>
+            </wp:cNvGraphicFramePr>
+            <a:graphic>
+              <a:graphicData xmlns:a="http://schemas.openxmlformats.org/drawingml/2006/main" uri="http://schemas.openxmlformats.org/drawingml/2006/picture">
+                <pic:pic xmlns:pic="http://schemas.openxmlformats.org/drawingml/2006/picture">
+                  <pic:nvPicPr>
+                    <pic:cNvPr id="1479525751" name="Picture 1479525751"/>
+                    <pic:cNvPicPr/>
+                  </pic:nvPicPr>
+                  <pic:blipFill>
+                    <a:blip xmlns:r="http://schemas.openxmlformats.org/officeDocument/2006/relationships" r:embed="rId1489064901">
+                      <a:extLst>
+                        <a:ext uri="{28A0092B-C50C-407E-A947-70E740481C1C}">
+                          <a14:useLocalDpi xmlns:a14="http://schemas.microsoft.com/office/drawing/2010/main"/>
+                        </a:ext>
+                      </a:extLst>
+                    </a:blip>
+                    <a:stretch>
+                      <a:fillRect/>
+                    </a:stretch>
+                  </pic:blipFill>
+                  <pic:spPr>
+                    <a:xfrm rot="0">
+                      <a:off x="0" y="0"/>
+                      <a:ext cx="5943600" cy="2828925"/>
+                    </a:xfrm>
+                    <a:prstGeom prst="rect">
+                      <a:avLst/>
+                    </a:prstGeom>
+                  </pic:spPr>
+                </pic:pic>
+              </a:graphicData>
+            </a:graphic>
+          </wp:inline>
+        </w:drawing>
+      </w:r>
+      <w:r>
+        <w:drawing>
+          <wp:inline wp14:editId="0F0A16FD" wp14:anchorId="174F0BAE">
+            <wp:extent cx="5943600" cy="2352675"/>
+            <wp:effectExtent l="0" t="0" r="0" b="0"/>
+            <wp:docPr id="938692130" name="drawing"/>
+            <wp:cNvGraphicFramePr>
+              <a:graphicFrameLocks noChangeAspect="1"/>
+            </wp:cNvGraphicFramePr>
+            <a:graphic>
+              <a:graphicData xmlns:a="http://schemas.openxmlformats.org/drawingml/2006/main" uri="http://schemas.openxmlformats.org/drawingml/2006/picture">
+                <pic:pic xmlns:pic="http://schemas.openxmlformats.org/drawingml/2006/picture">
+                  <pic:nvPicPr>
+                    <pic:cNvPr id="938692130" name="Picture 938692130"/>
+                    <pic:cNvPicPr/>
+                  </pic:nvPicPr>
+                  <pic:blipFill>
+                    <a:blip xmlns:r="http://schemas.openxmlformats.org/officeDocument/2006/relationships" r:embed="rId814145172">
+                      <a:extLst>
+                        <a:ext uri="{28A0092B-C50C-407E-A947-70E740481C1C}">
+                          <a14:useLocalDpi xmlns:a14="http://schemas.microsoft.com/office/drawing/2010/main"/>
+                        </a:ext>
+                      </a:extLst>
+                    </a:blip>
+                    <a:stretch>
+                      <a:fillRect/>
+                    </a:stretch>
+                  </pic:blipFill>
+                  <pic:spPr>
+                    <a:xfrm rot="0">
+                      <a:off x="0" y="0"/>
+                      <a:ext cx="5943600" cy="2352675"/>
+                    </a:xfrm>
+                    <a:prstGeom prst="rect">
+                      <a:avLst/>
+                    </a:prstGeom>
+                  </pic:spPr>
+                </pic:pic>
+              </a:graphicData>
+            </a:graphic>
+          </wp:inline>
+        </w:drawing>
+      </w:r>
+      <w:r>
+        <w:drawing>
+          <wp:inline wp14:editId="21678277" wp14:anchorId="1EC88CE0">
+            <wp:extent cx="5943600" cy="2651760"/>
+            <wp:effectExtent l="0" t="0" r="0" b="0"/>
+            <wp:docPr id="2080256161" name="drawing"/>
+            <wp:cNvGraphicFramePr>
+              <a:graphicFrameLocks/>
+            </wp:cNvGraphicFramePr>
+            <a:graphic>
+              <a:graphicData xmlns:a="http://schemas.openxmlformats.org/drawingml/2006/main" uri="http://schemas.openxmlformats.org/drawingml/2006/picture">
+                <pic:pic xmlns:pic="http://schemas.openxmlformats.org/drawingml/2006/picture">
+                  <pic:nvPicPr>
+                    <pic:cNvPr id="2080256161" name="Picture 2080256161"/>
+                    <pic:cNvPicPr/>
+                  </pic:nvPicPr>
+                  <pic:blipFill>
+                    <a:blip xmlns:r="http://schemas.openxmlformats.org/officeDocument/2006/relationships" r:embed="rId2076490119">
+                      <a:extLst>
+                        <a:ext uri="{28A0092B-C50C-407E-A947-70E740481C1C}">
+                          <a14:useLocalDpi xmlns:a14="http://schemas.microsoft.com/office/drawing/2010/main"/>
+                        </a:ext>
+                      </a:extLst>
+                    </a:blip>
+                    <a:stretch>
+                      <a:fillRect/>
+                    </a:stretch>
+                  </pic:blipFill>
+                  <pic:spPr>
+                    <a:xfrm rot="0">
+                      <a:off x="0" y="0"/>
+                      <a:ext cx="5943600" cy="2651760"/>
+                    </a:xfrm>
+                    <a:prstGeom prst="rect">
+                      <a:avLst/>
+                    </a:prstGeom>
+                  </pic:spPr>
+                </pic:pic>
+              </a:graphicData>
+            </a:graphic>
+          </wp:inline>
+        </w:drawing>
+      </w:r>
+      <w:r>
+        <w:drawing>
+          <wp:inline wp14:editId="546DA3D6" wp14:anchorId="17D6C55F">
+            <wp:extent cx="5943600" cy="2651760"/>
+            <wp:effectExtent l="0" t="0" r="0" b="0"/>
+            <wp:docPr id="1611135829" name="drawing"/>
+            <wp:cNvGraphicFramePr>
+              <a:graphicFrameLocks/>
+            </wp:cNvGraphicFramePr>
+            <a:graphic>
+              <a:graphicData xmlns:a="http://schemas.openxmlformats.org/drawingml/2006/main" uri="http://schemas.openxmlformats.org/drawingml/2006/picture">
+                <pic:pic xmlns:pic="http://schemas.openxmlformats.org/drawingml/2006/picture">
+                  <pic:nvPicPr>
+                    <pic:cNvPr id="1611135829" name="Picture 1611135829"/>
+                    <pic:cNvPicPr/>
+                  </pic:nvPicPr>
+                  <pic:blipFill>
+                    <a:blip xmlns:r="http://schemas.openxmlformats.org/officeDocument/2006/relationships" r:embed="rId299082755">
+                      <a:extLst>
+                        <a:ext uri="{28A0092B-C50C-407E-A947-70E740481C1C}">
+                          <a14:useLocalDpi xmlns:a14="http://schemas.microsoft.com/office/drawing/2010/main"/>
+                        </a:ext>
+                      </a:extLst>
+                    </a:blip>
+                    <a:stretch>
+                      <a:fillRect/>
+                    </a:stretch>
+                  </pic:blipFill>
+                  <pic:spPr>
+                    <a:xfrm rot="0">
+                      <a:off x="0" y="0"/>
+                      <a:ext cx="5943600" cy="2651760"/>
+                    </a:xfrm>
+                    <a:prstGeom prst="rect">
+                      <a:avLst/>
+                    </a:prstGeom>
+                  </pic:spPr>
+                </pic:pic>
+              </a:graphicData>
+            </a:graphic>
+          </wp:inline>
+        </w:drawing>
+      </w:r>
+      <w:r>
+        <w:drawing>
+          <wp:inline wp14:editId="4CD3949C" wp14:anchorId="26819A1D">
+            <wp:extent cx="5943600" cy="2651760"/>
+            <wp:effectExtent l="0" t="0" r="0" b="0"/>
+            <wp:docPr id="1468095577" name="drawing"/>
+            <wp:cNvGraphicFramePr>
+              <a:graphicFrameLocks/>
+            </wp:cNvGraphicFramePr>
+            <a:graphic>
+              <a:graphicData xmlns:a="http://schemas.openxmlformats.org/drawingml/2006/main" uri="http://schemas.openxmlformats.org/drawingml/2006/picture">
+                <pic:pic xmlns:pic="http://schemas.openxmlformats.org/drawingml/2006/picture">
+                  <pic:nvPicPr>
+                    <pic:cNvPr id="398065783" name="Picture 398065783"/>
+                    <pic:cNvPicPr/>
+                  </pic:nvPicPr>
+                  <pic:blipFill>
+                    <a:blip xmlns:r="http://schemas.openxmlformats.org/officeDocument/2006/relationships" r:embed="rId235466170">
+                      <a:extLst>
+                        <a:ext uri="{28A0092B-C50C-407E-A947-70E740481C1C}">
+                          <a14:useLocalDpi xmlns:a14="http://schemas.microsoft.com/office/drawing/2010/main"/>
+                        </a:ext>
+                      </a:extLst>
+                    </a:blip>
+                    <a:stretch>
+                      <a:fillRect/>
+                    </a:stretch>
+                  </pic:blipFill>
+                  <pic:spPr>
+                    <a:xfrm rot="0">
+                      <a:off x="0" y="0"/>
+                      <a:ext cx="5943600" cy="2651760"/>
+                    </a:xfrm>
+                    <a:prstGeom prst="rect">
+                      <a:avLst/>
+                    </a:prstGeom>
+                  </pic:spPr>
+                </pic:pic>
+              </a:graphicData>
+            </a:graphic>
+          </wp:inline>
+        </w:drawing>
+      </w:r>
     </w:p>
     <w:p>
       <w:pPr>
         <w:spacing w:before="0" w:beforeAutospacing="off" w:after="0" w:afterAutospacing="off"/>
       </w:pPr>
-    </w:p>
-    <w:p>
-      <w:pPr>
-        <w:spacing w:before="0" w:beforeAutospacing="off" w:after="0" w:afterAutospacing="off"/>
-      </w:pPr>
-    </w:p>
-    <w:p>
-      <w:pPr>
-        <w:spacing w:before="0" w:beforeAutospacing="off" w:after="0" w:afterAutospacing="off"/>
-      </w:pPr>
-    </w:p>
-    <w:p>
-      <w:pPr>
-        <w:pStyle w:val="Normal"/>
+      <w:r>
+        <w:drawing>
+          <wp:inline wp14:editId="60DA3929" wp14:anchorId="45F572BF">
+            <wp:extent cx="5944380" cy="2743200"/>
+            <wp:effectExtent l="0" t="0" r="0" b="0"/>
+            <wp:docPr id="1348489498" name="drawing"/>
+            <wp:cNvGraphicFramePr>
+              <a:graphicFrameLocks/>
+            </wp:cNvGraphicFramePr>
+            <a:graphic>
+              <a:graphicData xmlns:a="http://schemas.openxmlformats.org/drawingml/2006/main" uri="http://schemas.openxmlformats.org/drawingml/2006/picture">
+                <pic:pic xmlns:pic="http://schemas.openxmlformats.org/drawingml/2006/picture">
+                  <pic:nvPicPr>
+                    <pic:cNvPr id="1348489498" name="Picture 1348489498"/>
+                    <pic:cNvPicPr/>
+                  </pic:nvPicPr>
+                  <pic:blipFill>
+                    <a:blip xmlns:r="http://schemas.openxmlformats.org/officeDocument/2006/relationships" r:embed="rId785852118">
+                      <a:extLst>
+                        <a:ext uri="{28A0092B-C50C-407E-A947-70E740481C1C}">
+                          <a14:useLocalDpi xmlns:a14="http://schemas.microsoft.com/office/drawing/2010/main"/>
+                        </a:ext>
+                      </a:extLst>
+                    </a:blip>
+                    <a:stretch>
+                      <a:fillRect/>
+                    </a:stretch>
+                  </pic:blipFill>
+                  <pic:spPr>
+                    <a:xfrm rot="0">
+                      <a:off x="0" y="0"/>
+                      <a:ext cx="5944380" cy="2743200"/>
+                    </a:xfrm>
+                    <a:prstGeom prst="rect">
+                      <a:avLst/>
+                    </a:prstGeom>
+                  </pic:spPr>
+                </pic:pic>
+              </a:graphicData>
+            </a:graphic>
+          </wp:inline>
+        </w:drawing>
+      </w:r>
+      <w:r>
+        <w:drawing>
+          <wp:inline wp14:editId="6D8176A3" wp14:anchorId="49080C79">
+            <wp:extent cx="5944380" cy="2743200"/>
+            <wp:effectExtent l="0" t="0" r="0" b="0"/>
+            <wp:docPr id="1034932621" name="drawing"/>
+            <wp:cNvGraphicFramePr>
+              <a:graphicFrameLocks/>
+            </wp:cNvGraphicFramePr>
+            <a:graphic>
+              <a:graphicData xmlns:a="http://schemas.openxmlformats.org/drawingml/2006/main" uri="http://schemas.openxmlformats.org/drawingml/2006/picture">
+                <pic:pic xmlns:pic="http://schemas.openxmlformats.org/drawingml/2006/picture">
+                  <pic:nvPicPr>
+                    <pic:cNvPr id="1034932621" name="Picture 1034932621"/>
+                    <pic:cNvPicPr/>
+                  </pic:nvPicPr>
+                  <pic:blipFill>
+                    <a:blip xmlns:r="http://schemas.openxmlformats.org/officeDocument/2006/relationships" r:embed="rId596257598">
+                      <a:extLst>
+                        <a:ext uri="{28A0092B-C50C-407E-A947-70E740481C1C}">
+                          <a14:useLocalDpi xmlns:a14="http://schemas.microsoft.com/office/drawing/2010/main"/>
+                        </a:ext>
+                      </a:extLst>
+                    </a:blip>
+                    <a:stretch>
+                      <a:fillRect/>
+                    </a:stretch>
+                  </pic:blipFill>
+                  <pic:spPr>
+                    <a:xfrm rot="0">
+                      <a:off x="0" y="0"/>
+                      <a:ext cx="5944380" cy="2743200"/>
+                    </a:xfrm>
+                    <a:prstGeom prst="rect">
+                      <a:avLst/>
+                    </a:prstGeom>
+                  </pic:spPr>
+                </pic:pic>
+              </a:graphicData>
+            </a:graphic>
+          </wp:inline>
+        </w:drawing>
+      </w:r>
+    </w:p>
+    <w:p>
+      <w:pPr>
         <w:spacing w:before="0" w:beforeAutospacing="off" w:after="0" w:afterAutospacing="off"/>
       </w:pPr>
     </w:p>

</xml_diff>